<commit_message>
added video, trace and raw report
</commit_message>
<xml_diff>
--- a/lab2/report_lr2.docx
+++ b/lab2/report_lr2.docx
@@ -151,7 +151,7 @@
           <w:color w:val="000000"/>
           <w:sz w:val="28"/>
           <w:szCs w:val="28"/>
-          <w:lang w:eastAsia="uk-UA"/>
+          <w:lang w:val="en-US" w:eastAsia="uk-UA"/>
         </w:rPr>
       </w:pPr>
       <w:r>
@@ -188,7 +188,19 @@
           <w:szCs w:val="28"/>
           <w:lang w:eastAsia="uk-UA"/>
         </w:rPr>
-        <w:t xml:space="preserve"> №1</w:t>
+        <w:t xml:space="preserve"> №</w:t>
+      </w:r>
+      <w:r>
+        <w:rPr>
+          <w:rFonts w:ascii="Times New Roman" w:eastAsia="Times New Roman" w:hAnsi="Times New Roman" w:cs="Times New Roman"/>
+          <w:i/>
+          <w:iCs/>
+          <w:color w:val="000000"/>
+          <w:sz w:val="28"/>
+          <w:szCs w:val="28"/>
+          <w:lang w:val="en-US" w:eastAsia="uk-UA"/>
+        </w:rPr>
+        <w:t>2</w:t>
       </w:r>
     </w:p>
     <w:p>
@@ -996,12 +1008,13 @@
     <w:p>
       <w:pPr>
         <w:pStyle w:val="a3"/>
-        <w:spacing w:before="0" w:beforeAutospacing="0" w:after="0" w:afterAutospacing="0" w:line="360" w:lineRule="auto"/>
+        <w:spacing w:line="360" w:lineRule="auto"/>
         <w:jc w:val="both"/>
         <w:rPr>
           <w:color w:val="000000"/>
           <w:sz w:val="28"/>
           <w:szCs w:val="28"/>
+          <w:lang w:val="en-US"/>
         </w:rPr>
       </w:pPr>
       <w:r>
@@ -1027,37 +1040,10 @@
           <w:color w:val="000000"/>
           <w:sz w:val="28"/>
           <w:szCs w:val="28"/>
-        </w:rPr>
-        <w:t xml:space="preserve">Lab1 - </w:t>
-      </w:r>
-      <w:proofErr w:type="spellStart"/>
-      <w:r>
-        <w:rPr>
-          <w:color w:val="000000"/>
-          <w:sz w:val="28"/>
-          <w:szCs w:val="28"/>
-        </w:rPr>
-        <w:t>Hello</w:t>
-      </w:r>
-      <w:proofErr w:type="spellEnd"/>
-      <w:r>
-        <w:rPr>
-          <w:color w:val="000000"/>
-          <w:sz w:val="28"/>
-          <w:szCs w:val="28"/>
-        </w:rPr>
-        <w:t xml:space="preserve"> </w:t>
-      </w:r>
-      <w:proofErr w:type="spellStart"/>
-      <w:r>
-        <w:rPr>
-          <w:color w:val="000000"/>
-          <w:sz w:val="28"/>
-          <w:szCs w:val="28"/>
-        </w:rPr>
-        <w:t>World</w:t>
-      </w:r>
-      <w:proofErr w:type="spellEnd"/>
+          <w:lang w:val="en-US"/>
+        </w:rPr>
+        <w:t>Lab2 - LEDs, Buttons, Interrupts</w:t>
+      </w:r>
     </w:p>
     <w:p>
       <w:pPr>
@@ -1069,6 +1055,7 @@
           <w:bCs/>
           <w:sz w:val="28"/>
           <w:szCs w:val="28"/>
+          <w:lang w:val="en-US"/>
         </w:rPr>
       </w:pPr>
       <w:r>
@@ -1095,45 +1082,10 @@
       <w:r>
         <w:rPr>
           <w:rFonts w:ascii="Times New Roman" w:hAnsi="Times New Roman" w:cs="Times New Roman"/>
-          <w:noProof/>
-          <w:sz w:val="28"/>
-          <w:szCs w:val="28"/>
-        </w:rPr>
-        <w:drawing>
-          <wp:inline distT="0" distB="0" distL="0" distR="0" wp14:anchorId="554FF54F" wp14:editId="5CB34A4F">
-            <wp:extent cx="6120765" cy="3251200"/>
-            <wp:effectExtent l="0" t="0" r="0" b="6350"/>
-            <wp:docPr id="519094023" name="Рисунок 1"/>
-            <wp:cNvGraphicFramePr>
-              <a:graphicFrameLocks xmlns:a="http://schemas.openxmlformats.org/drawingml/2006/main" noChangeAspect="1"/>
-            </wp:cNvGraphicFramePr>
-            <a:graphic xmlns:a="http://schemas.openxmlformats.org/drawingml/2006/main">
-              <a:graphicData uri="http://schemas.openxmlformats.org/drawingml/2006/picture">
-                <pic:pic xmlns:pic="http://schemas.openxmlformats.org/drawingml/2006/picture">
-                  <pic:nvPicPr>
-                    <pic:cNvPr id="519094023" name=""/>
-                    <pic:cNvPicPr/>
-                  </pic:nvPicPr>
-                  <pic:blipFill>
-                    <a:blip r:embed="rId5"/>
-                    <a:stretch>
-                      <a:fillRect/>
-                    </a:stretch>
-                  </pic:blipFill>
-                  <pic:spPr>
-                    <a:xfrm>
-                      <a:off x="0" y="0"/>
-                      <a:ext cx="6120765" cy="3251200"/>
-                    </a:xfrm>
-                    <a:prstGeom prst="rect">
-                      <a:avLst/>
-                    </a:prstGeom>
-                  </pic:spPr>
-                </pic:pic>
-              </a:graphicData>
-            </a:graphic>
-          </wp:inline>
-        </w:drawing>
+          <w:sz w:val="28"/>
+          <w:szCs w:val="28"/>
+        </w:rPr>
+        <w:t>Посилання на додаток:</w:t>
       </w:r>
     </w:p>
     <w:p>
@@ -1146,14 +1098,6 @@
           <w:szCs w:val="28"/>
         </w:rPr>
       </w:pPr>
-      <w:r>
-        <w:rPr>
-          <w:rFonts w:ascii="Times New Roman" w:hAnsi="Times New Roman" w:cs="Times New Roman"/>
-          <w:sz w:val="28"/>
-          <w:szCs w:val="28"/>
-        </w:rPr>
-        <w:t>Посилання на додаток:</w:t>
-      </w:r>
     </w:p>
     <w:p>
       <w:pPr>
@@ -1165,17 +1109,14 @@
           <w:szCs w:val="28"/>
         </w:rPr>
       </w:pPr>
-      <w:hyperlink r:id="rId6" w:history="1">
-        <w:r>
-          <w:rPr>
-            <w:rStyle w:val="a5"/>
-            <w:rFonts w:ascii="Times New Roman" w:hAnsi="Times New Roman" w:cs="Times New Roman"/>
-            <w:sz w:val="28"/>
-            <w:szCs w:val="28"/>
-          </w:rPr>
-          <w:t>https://github.com/bumajnici/C_Labs/blob/main/lab1/Core/Src/main.c</w:t>
-        </w:r>
-      </w:hyperlink>
+      <w:r>
+        <w:rPr>
+          <w:rFonts w:ascii="Times New Roman" w:hAnsi="Times New Roman" w:cs="Times New Roman"/>
+          <w:sz w:val="28"/>
+          <w:szCs w:val="28"/>
+        </w:rPr>
+        <w:t>Посилання на відео:</w:t>
+      </w:r>
     </w:p>
     <w:p>
       <w:pPr>
@@ -1204,7 +1145,25 @@
           <w:sz w:val="28"/>
           <w:szCs w:val="28"/>
         </w:rPr>
-        <w:t>Посилання на відео:</w:t>
+        <w:t xml:space="preserve">Посилання на </w:t>
+      </w:r>
+      <w:proofErr w:type="spellStart"/>
+      <w:r>
+        <w:rPr>
+          <w:rFonts w:ascii="Times New Roman" w:hAnsi="Times New Roman" w:cs="Times New Roman"/>
+          <w:sz w:val="28"/>
+          <w:szCs w:val="28"/>
+        </w:rPr>
+        <w:t>трейс</w:t>
+      </w:r>
+      <w:proofErr w:type="spellEnd"/>
+      <w:r>
+        <w:rPr>
+          <w:rFonts w:ascii="Times New Roman" w:hAnsi="Times New Roman" w:cs="Times New Roman"/>
+          <w:sz w:val="28"/>
+          <w:szCs w:val="28"/>
+        </w:rPr>
+        <w:t xml:space="preserve"> з логічного аналізатора:</w:t>
       </w:r>
     </w:p>
     <w:p>
@@ -1217,87 +1176,6 @@
           <w:szCs w:val="28"/>
         </w:rPr>
       </w:pPr>
-      <w:hyperlink r:id="rId7" w:history="1">
-        <w:r>
-          <w:rPr>
-            <w:rStyle w:val="a5"/>
-            <w:rFonts w:ascii="Times New Roman" w:hAnsi="Times New Roman" w:cs="Times New Roman"/>
-            <w:sz w:val="28"/>
-            <w:szCs w:val="28"/>
-          </w:rPr>
-          <w:t>https://github.com/bumajnici/C_Labs/blob/main/lab1/2026-10-12%2020-57-24.mp4</w:t>
-        </w:r>
-      </w:hyperlink>
-    </w:p>
-    <w:p>
-      <w:pPr>
-        <w:spacing w:after="0" w:line="360" w:lineRule="auto"/>
-        <w:jc w:val="both"/>
-        <w:rPr>
-          <w:rFonts w:ascii="Times New Roman" w:hAnsi="Times New Roman" w:cs="Times New Roman"/>
-          <w:sz w:val="28"/>
-          <w:szCs w:val="28"/>
-        </w:rPr>
-      </w:pPr>
-    </w:p>
-    <w:p>
-      <w:pPr>
-        <w:spacing w:after="0" w:line="360" w:lineRule="auto"/>
-        <w:jc w:val="both"/>
-        <w:rPr>
-          <w:rFonts w:ascii="Times New Roman" w:hAnsi="Times New Roman" w:cs="Times New Roman"/>
-          <w:sz w:val="28"/>
-          <w:szCs w:val="28"/>
-        </w:rPr>
-      </w:pPr>
-      <w:r>
-        <w:rPr>
-          <w:rFonts w:ascii="Times New Roman" w:hAnsi="Times New Roman" w:cs="Times New Roman"/>
-          <w:sz w:val="28"/>
-          <w:szCs w:val="28"/>
-        </w:rPr>
-        <w:t xml:space="preserve">Посилання на </w:t>
-      </w:r>
-      <w:proofErr w:type="spellStart"/>
-      <w:r>
-        <w:rPr>
-          <w:rFonts w:ascii="Times New Roman" w:hAnsi="Times New Roman" w:cs="Times New Roman"/>
-          <w:sz w:val="28"/>
-          <w:szCs w:val="28"/>
-        </w:rPr>
-        <w:t>трейс</w:t>
-      </w:r>
-      <w:proofErr w:type="spellEnd"/>
-      <w:r>
-        <w:rPr>
-          <w:rFonts w:ascii="Times New Roman" w:hAnsi="Times New Roman" w:cs="Times New Roman"/>
-          <w:sz w:val="28"/>
-          <w:szCs w:val="28"/>
-        </w:rPr>
-        <w:t xml:space="preserve"> з логічного аналізатора:</w:t>
-      </w:r>
-    </w:p>
-    <w:p>
-      <w:pPr>
-        <w:spacing w:after="0" w:line="360" w:lineRule="auto"/>
-        <w:jc w:val="both"/>
-        <w:rPr>
-          <w:rFonts w:ascii="Times New Roman" w:hAnsi="Times New Roman" w:cs="Times New Roman"/>
-          <w:sz w:val="28"/>
-          <w:szCs w:val="28"/>
-        </w:rPr>
-      </w:pPr>
-      <w:hyperlink r:id="rId8" w:history="1">
-        <w:r>
-          <w:rPr>
-            <w:rStyle w:val="a5"/>
-            <w:rFonts w:ascii="Times New Roman" w:hAnsi="Times New Roman" w:cs="Times New Roman"/>
-            <w:sz w:val="28"/>
-            <w:szCs w:val="28"/>
-          </w:rPr>
-          <w:t>https://github.com/bumajnici/C_Labs/blob/main/lab1/Session%200_.sal</w:t>
-        </w:r>
-      </w:hyperlink>
     </w:p>
     <w:sectPr>
       <w:pgSz w:w="11906" w:h="16838"/>
@@ -2047,10 +1925,30 @@
     <w:qFormat/>
     <w:rsid w:val="008A5121"/>
   </w:style>
+  <w:style w:type="paragraph" w:styleId="1">
+    <w:name w:val="heading 1"/>
+    <w:basedOn w:val="a"/>
+    <w:next w:val="a"/>
+    <w:link w:val="10"/>
+    <w:uiPriority w:val="9"/>
+    <w:qFormat/>
+    <w:rsid w:val="00A67AEE"/>
+    <w:pPr>
+      <w:keepNext/>
+      <w:keepLines/>
+      <w:spacing w:before="240" w:after="0"/>
+      <w:outlineLvl w:val="0"/>
+    </w:pPr>
+    <w:rPr>
+      <w:rFonts w:asciiTheme="majorHAnsi" w:eastAsiaTheme="majorEastAsia" w:hAnsiTheme="majorHAnsi" w:cstheme="majorBidi"/>
+      <w:color w:val="2F5496" w:themeColor="accent1" w:themeShade="BF"/>
+      <w:sz w:val="32"/>
+      <w:szCs w:val="32"/>
+    </w:rPr>
+  </w:style>
   <w:style w:type="character" w:default="1" w:styleId="a0">
     <w:name w:val="Default Paragraph Font"/>
     <w:uiPriority w:val="1"/>
-    <w:semiHidden/>
     <w:unhideWhenUsed/>
   </w:style>
   <w:style w:type="table" w:default="1" w:styleId="a1">
@@ -2127,6 +2025,19 @@
     <w:rPr>
       <w:color w:val="605E5C"/>
       <w:shd w:val="clear" w:color="auto" w:fill="E1DFDD"/>
+    </w:rPr>
+  </w:style>
+  <w:style w:type="character" w:customStyle="1" w:styleId="10">
+    <w:name w:val="Заголовок 1 Знак"/>
+    <w:basedOn w:val="a0"/>
+    <w:link w:val="1"/>
+    <w:uiPriority w:val="9"/>
+    <w:rsid w:val="00A67AEE"/>
+    <w:rPr>
+      <w:rFonts w:asciiTheme="majorHAnsi" w:eastAsiaTheme="majorEastAsia" w:hAnsiTheme="majorHAnsi" w:cstheme="majorBidi"/>
+      <w:color w:val="2F5496" w:themeColor="accent1" w:themeShade="BF"/>
+      <w:sz w:val="32"/>
+      <w:szCs w:val="32"/>
     </w:rPr>
   </w:style>
 </w:styles>

</xml_diff>